<commit_message>
Here I made the Class Diagram and half of the Process Model, also Yazan made the Use Case Diagram
</commit_message>
<xml_diff>
--- a/docs/SRS - LBMS.docx
+++ b/docs/SRS - LBMS.docx
@@ -5976,7 +5976,37 @@
           <w:sz w:val="28"/>
           <w:szCs w:val="28"/>
         </w:rPr>
-        <w:t xml:space="preserve"> shall allow </w:t>
+        <w:t xml:space="preserve"> shall </w:t>
+      </w:r>
+      <w:r>
+        <w:rPr>
+          <w:sz w:val="28"/>
+          <w:szCs w:val="28"/>
+        </w:rPr>
+        <w:t xml:space="preserve">generate </w:t>
+      </w:r>
+      <w:r>
+        <w:rPr>
+          <w:b/>
+          <w:bCs/>
+          <w:sz w:val="28"/>
+          <w:szCs w:val="28"/>
+        </w:rPr>
+        <w:t>receipt</w:t>
+      </w:r>
+      <w:r>
+        <w:rPr>
+          <w:sz w:val="28"/>
+          <w:szCs w:val="28"/>
+        </w:rPr>
+        <w:t xml:space="preserve"> </w:t>
+      </w:r>
+      <w:r>
+        <w:rPr>
+          <w:sz w:val="28"/>
+          <w:szCs w:val="28"/>
+        </w:rPr>
+        <w:t xml:space="preserve">for </w:t>
       </w:r>
       <w:r>
         <w:rPr>
@@ -5992,23 +6022,14 @@
           <w:sz w:val="28"/>
           <w:szCs w:val="28"/>
         </w:rPr>
-        <w:t xml:space="preserve"> to </w:t>
-      </w:r>
-      <w:r>
-        <w:rPr>
-          <w:b/>
-          <w:bCs/>
-          <w:sz w:val="28"/>
-          <w:szCs w:val="28"/>
-        </w:rPr>
-        <w:t>browse</w:t>
-      </w:r>
-      <w:r>
-        <w:rPr>
-          <w:sz w:val="28"/>
-          <w:szCs w:val="28"/>
-        </w:rPr>
-        <w:t xml:space="preserve"> their borrowed and purchased books.</w:t>
+        <w:t xml:space="preserve"> </w:t>
+      </w:r>
+      <w:r>
+        <w:rPr>
+          <w:sz w:val="28"/>
+          <w:szCs w:val="28"/>
+        </w:rPr>
+        <w:t>automatically after purchasing or borrowing books.</w:t>
       </w:r>
     </w:p>
     <w:p>
@@ -6070,6 +6091,75 @@
           <w:sz w:val="28"/>
           <w:szCs w:val="28"/>
         </w:rPr>
+        <w:t>browse</w:t>
+      </w:r>
+      <w:r>
+        <w:rPr>
+          <w:sz w:val="28"/>
+          <w:szCs w:val="28"/>
+        </w:rPr>
+        <w:t xml:space="preserve"> their borrowed and purchased books.</w:t>
+      </w:r>
+    </w:p>
+    <w:p>
+      <w:pPr>
+        <w:pStyle w:val="a6"/>
+        <w:numPr>
+          <w:ilvl w:val="0"/>
+          <w:numId w:val="9"/>
+        </w:numPr>
+        <w:jc w:val="both"/>
+        <w:rPr>
+          <w:sz w:val="28"/>
+          <w:szCs w:val="28"/>
+        </w:rPr>
+      </w:pPr>
+      <w:r>
+        <w:rPr>
+          <w:sz w:val="28"/>
+          <w:szCs w:val="28"/>
+        </w:rPr>
+        <w:t xml:space="preserve">The </w:t>
+      </w:r>
+      <w:r>
+        <w:rPr>
+          <w:b/>
+          <w:bCs/>
+          <w:sz w:val="28"/>
+          <w:szCs w:val="28"/>
+        </w:rPr>
+        <w:t>system</w:t>
+      </w:r>
+      <w:r>
+        <w:rPr>
+          <w:sz w:val="28"/>
+          <w:szCs w:val="28"/>
+        </w:rPr>
+        <w:t xml:space="preserve"> shall allow </w:t>
+      </w:r>
+      <w:r>
+        <w:rPr>
+          <w:b/>
+          <w:bCs/>
+          <w:sz w:val="28"/>
+          <w:szCs w:val="28"/>
+        </w:rPr>
+        <w:t>customers</w:t>
+      </w:r>
+      <w:r>
+        <w:rPr>
+          <w:sz w:val="28"/>
+          <w:szCs w:val="28"/>
+        </w:rPr>
+        <w:t xml:space="preserve"> to </w:t>
+      </w:r>
+      <w:r>
+        <w:rPr>
+          <w:b/>
+          <w:bCs/>
+          <w:sz w:val="28"/>
+          <w:szCs w:val="28"/>
+        </w:rPr>
         <w:t>return</w:t>
       </w:r>
       <w:r>
@@ -6381,6 +6471,7 @@
           <w:sz w:val="28"/>
           <w:szCs w:val="28"/>
         </w:rPr>
+        <w:lastRenderedPageBreak/>
         <w:t xml:space="preserve">The </w:t>
       </w:r>
       <w:r>
@@ -6466,7 +6557,6 @@
           <w:sz w:val="28"/>
           <w:szCs w:val="28"/>
         </w:rPr>
-        <w:lastRenderedPageBreak/>
         <w:t xml:space="preserve">The </w:t>
       </w:r>
       <w:r>
@@ -7020,26 +7110,6 @@
         <w:rPr>
           <w:sz w:val="36"/>
           <w:szCs w:val="36"/>
-          <w:rtl/>
-        </w:rPr>
-      </w:pPr>
-    </w:p>
-    <w:p>
-      <w:pPr>
-        <w:jc w:val="both"/>
-        <w:rPr>
-          <w:sz w:val="36"/>
-          <w:szCs w:val="36"/>
-          <w:rtl/>
-        </w:rPr>
-      </w:pPr>
-    </w:p>
-    <w:p>
-      <w:pPr>
-        <w:jc w:val="both"/>
-        <w:rPr>
-          <w:sz w:val="36"/>
-          <w:szCs w:val="36"/>
         </w:rPr>
       </w:pPr>
     </w:p>
@@ -8143,6 +8213,78 @@
       </w:pPr>
       <w:r>
         <w:rPr>
+          <w:rFonts w:asciiTheme="majorHAnsi" w:eastAsiaTheme="majorEastAsia" w:hAnsiTheme="majorHAnsi" w:cstheme="majorBidi"/>
+          <w:noProof/>
+          <w:color w:val="2F5496" w:themeColor="accent1" w:themeShade="BF"/>
+          <w:sz w:val="48"/>
+          <w:szCs w:val="48"/>
+        </w:rPr>
+        <w:drawing>
+          <wp:anchor distT="0" distB="0" distL="114300" distR="114300" simplePos="0" relativeHeight="251660288" behindDoc="0" locked="0" layoutInCell="1" allowOverlap="1" wp14:anchorId="60525707" wp14:editId="1E5A2F49">
+            <wp:simplePos x="0" y="0"/>
+            <wp:positionH relativeFrom="column">
+              <wp:posOffset>595563</wp:posOffset>
+            </wp:positionH>
+            <wp:positionV relativeFrom="paragraph">
+              <wp:posOffset>41977</wp:posOffset>
+            </wp:positionV>
+            <wp:extent cx="4277226" cy="7702850"/>
+            <wp:effectExtent l="0" t="0" r="9525" b="0"/>
+            <wp:wrapThrough wrapText="bothSides">
+              <wp:wrapPolygon edited="0">
+                <wp:start x="0" y="0"/>
+                <wp:lineTo x="0" y="21529"/>
+                <wp:lineTo x="21552" y="21529"/>
+                <wp:lineTo x="21552" y="0"/>
+                <wp:lineTo x="0" y="0"/>
+              </wp:wrapPolygon>
+            </wp:wrapThrough>
+            <wp:docPr id="977423960" name="صورة 2"/>
+            <wp:cNvGraphicFramePr>
+              <a:graphicFrameLocks xmlns:a="http://schemas.openxmlformats.org/drawingml/2006/main" noChangeAspect="1"/>
+            </wp:cNvGraphicFramePr>
+            <a:graphic xmlns:a="http://schemas.openxmlformats.org/drawingml/2006/main">
+              <a:graphicData uri="http://schemas.openxmlformats.org/drawingml/2006/picture">
+                <pic:pic xmlns:pic="http://schemas.openxmlformats.org/drawingml/2006/picture">
+                  <pic:nvPicPr>
+                    <pic:cNvPr id="977423960" name="صورة 977423960"/>
+                    <pic:cNvPicPr/>
+                  </pic:nvPicPr>
+                  <pic:blipFill>
+                    <a:blip r:embed="rId9">
+                      <a:extLst>
+                        <a:ext uri="{28A0092B-C50C-407E-A947-70E740481C1C}">
+                          <a14:useLocalDpi xmlns:a14="http://schemas.microsoft.com/office/drawing/2010/main" val="0"/>
+                        </a:ext>
+                      </a:extLst>
+                    </a:blip>
+                    <a:stretch>
+                      <a:fillRect/>
+                    </a:stretch>
+                  </pic:blipFill>
+                  <pic:spPr>
+                    <a:xfrm>
+                      <a:off x="0" y="0"/>
+                      <a:ext cx="4277727" cy="7703752"/>
+                    </a:xfrm>
+                    <a:prstGeom prst="rect">
+                      <a:avLst/>
+                    </a:prstGeom>
+                  </pic:spPr>
+                </pic:pic>
+              </a:graphicData>
+            </a:graphic>
+            <wp14:sizeRelH relativeFrom="page">
+              <wp14:pctWidth>0</wp14:pctWidth>
+            </wp14:sizeRelH>
+            <wp14:sizeRelV relativeFrom="page">
+              <wp14:pctHeight>0</wp14:pctHeight>
+            </wp14:sizeRelV>
+          </wp:anchor>
+        </w:drawing>
+      </w:r>
+      <w:r>
+        <w:rPr>
           <w:sz w:val="48"/>
           <w:szCs w:val="48"/>
         </w:rPr>
@@ -8345,6 +8487,80 @@
           <w:szCs w:val="48"/>
         </w:rPr>
       </w:pPr>
+      <w:r>
+        <w:rPr>
+          <w:noProof/>
+          <w:sz w:val="48"/>
+          <w:szCs w:val="48"/>
+        </w:rPr>
+        <w:drawing>
+          <wp:anchor distT="0" distB="0" distL="114300" distR="114300" simplePos="0" relativeHeight="251661312" behindDoc="0" locked="0" layoutInCell="1" allowOverlap="1" wp14:anchorId="0CABA036" wp14:editId="6FE2A502">
+            <wp:simplePos x="0" y="0"/>
+            <wp:positionH relativeFrom="margin">
+              <wp:align>center</wp:align>
+            </wp:positionH>
+            <wp:positionV relativeFrom="paragraph">
+              <wp:posOffset>522605</wp:posOffset>
+            </wp:positionV>
+            <wp:extent cx="7552690" cy="4493260"/>
+            <wp:effectExtent l="0" t="0" r="0" b="2540"/>
+            <wp:wrapThrough wrapText="bothSides">
+              <wp:wrapPolygon edited="0">
+                <wp:start x="0" y="0"/>
+                <wp:lineTo x="0" y="21521"/>
+                <wp:lineTo x="21520" y="21521"/>
+                <wp:lineTo x="21520" y="0"/>
+                <wp:lineTo x="0" y="0"/>
+              </wp:wrapPolygon>
+            </wp:wrapThrough>
+            <wp:docPr id="1957838777" name="صورة 1">
+              <a:hlinkClick xmlns:a="http://schemas.openxmlformats.org/drawingml/2006/main" r:id="rId10"/>
+            </wp:docPr>
+            <wp:cNvGraphicFramePr>
+              <a:graphicFrameLocks xmlns:a="http://schemas.openxmlformats.org/drawingml/2006/main" noChangeAspect="1"/>
+            </wp:cNvGraphicFramePr>
+            <a:graphic xmlns:a="http://schemas.openxmlformats.org/drawingml/2006/main">
+              <a:graphicData uri="http://schemas.openxmlformats.org/drawingml/2006/picture">
+                <pic:pic xmlns:pic="http://schemas.openxmlformats.org/drawingml/2006/picture">
+                  <pic:nvPicPr>
+                    <pic:cNvPr id="1957838777" name="صورة 1">
+                      <a:hlinkClick r:id="rId10"/>
+                    </pic:cNvPr>
+                    <pic:cNvPicPr/>
+                  </pic:nvPicPr>
+                  <pic:blipFill>
+                    <a:blip r:embed="rId11" cstate="print">
+                      <a:extLst>
+                        <a:ext uri="{28A0092B-C50C-407E-A947-70E740481C1C}">
+                          <a14:useLocalDpi xmlns:a14="http://schemas.microsoft.com/office/drawing/2010/main" val="0"/>
+                        </a:ext>
+                      </a:extLst>
+                    </a:blip>
+                    <a:stretch>
+                      <a:fillRect/>
+                    </a:stretch>
+                  </pic:blipFill>
+                  <pic:spPr>
+                    <a:xfrm>
+                      <a:off x="0" y="0"/>
+                      <a:ext cx="7552690" cy="4493260"/>
+                    </a:xfrm>
+                    <a:prstGeom prst="rect">
+                      <a:avLst/>
+                    </a:prstGeom>
+                  </pic:spPr>
+                </pic:pic>
+              </a:graphicData>
+            </a:graphic>
+            <wp14:sizeRelH relativeFrom="page">
+              <wp14:pctWidth>0</wp14:pctWidth>
+            </wp14:sizeRelH>
+            <wp14:sizeRelV relativeFrom="page">
+              <wp14:pctHeight>0</wp14:pctHeight>
+            </wp14:sizeRelV>
+          </wp:anchor>
+        </w:drawing>
+      </w:r>
       <w:r>
         <w:rPr>
           <w:sz w:val="48"/>
@@ -9543,6 +9759,14 @@
                 <w:szCs w:val="32"/>
               </w:rPr>
             </w:pPr>
+            <w:r>
+              <w:rPr>
+                <w:rFonts w:ascii="Segoe UI Emoji" w:hAnsi="Segoe UI Emoji" w:cs="Segoe UI Emoji"/>
+                <w:sz w:val="32"/>
+                <w:szCs w:val="32"/>
+              </w:rPr>
+              <w:t>✅</w:t>
+            </w:r>
           </w:p>
         </w:tc>
       </w:tr>
@@ -9903,6 +10127,14 @@
                 <w:szCs w:val="32"/>
               </w:rPr>
             </w:pPr>
+            <w:r>
+              <w:rPr>
+                <w:rFonts w:ascii="Segoe UI Emoji" w:hAnsi="Segoe UI Emoji" w:cs="Segoe UI Emoji"/>
+                <w:sz w:val="32"/>
+                <w:szCs w:val="32"/>
+              </w:rPr>
+              <w:t>✅</w:t>
+            </w:r>
           </w:p>
         </w:tc>
       </w:tr>
@@ -10922,7 +11154,7 @@
       </w:pPr>
     </w:p>
     <w:sectPr>
-      <w:footerReference w:type="default" r:id="rId9"/>
+      <w:footerReference w:type="default" r:id="rId12"/>
       <w:pgSz w:w="12240" w:h="15840"/>
       <w:pgMar w:top="1440" w:right="1800" w:bottom="1440" w:left="1800" w:header="720" w:footer="720" w:gutter="0"/>
       <w:cols w:space="720"/>

</xml_diff>

<commit_message>
Here Basim and Yazen put the 'use case diagram, system architecture, context mode, process model - with some help from Reda-, I just deleted 'Hussain' because he didin't do anything of his parts... I alsom put a pure 'template' for the code
</commit_message>
<xml_diff>
--- a/docs/SRS - LBMS.docx
+++ b/docs/SRS - LBMS.docx
@@ -4873,165 +4873,92 @@
     </w:p>
     <w:p>
       <w:pPr>
-        <w:jc w:val="both"/>
         <w:rPr>
           <w:sz w:val="36"/>
           <w:szCs w:val="36"/>
         </w:rPr>
       </w:pPr>
-    </w:p>
-    <w:p>
-      <w:pPr>
-        <w:jc w:val="both"/>
-        <w:rPr>
+      <w:r>
+        <w:rPr>
+          <w:noProof/>
           <w:sz w:val="36"/>
           <w:szCs w:val="36"/>
         </w:rPr>
-      </w:pPr>
-    </w:p>
-    <w:p>
-      <w:pPr>
-        <w:jc w:val="both"/>
+        <w:drawing>
+          <wp:anchor distT="0" distB="0" distL="114300" distR="114300" simplePos="0" relativeHeight="251665408" behindDoc="0" locked="0" layoutInCell="1" allowOverlap="1" wp14:anchorId="77AEF9E9" wp14:editId="5B699A85">
+            <wp:simplePos x="0" y="0"/>
+            <wp:positionH relativeFrom="page">
+              <wp:align>left</wp:align>
+            </wp:positionH>
+            <wp:positionV relativeFrom="paragraph">
+              <wp:posOffset>367121</wp:posOffset>
+            </wp:positionV>
+            <wp:extent cx="7737465" cy="3080657"/>
+            <wp:effectExtent l="0" t="0" r="0" b="5715"/>
+            <wp:wrapThrough wrapText="bothSides">
+              <wp:wrapPolygon edited="0">
+                <wp:start x="0" y="0"/>
+                <wp:lineTo x="0" y="21506"/>
+                <wp:lineTo x="21540" y="21506"/>
+                <wp:lineTo x="21540" y="0"/>
+                <wp:lineTo x="0" y="0"/>
+              </wp:wrapPolygon>
+            </wp:wrapThrough>
+            <wp:docPr id="537622877" name="صورة 7">
+              <a:hlinkClick xmlns:a="http://schemas.openxmlformats.org/drawingml/2006/main" r:id="rId9"/>
+            </wp:docPr>
+            <wp:cNvGraphicFramePr>
+              <a:graphicFrameLocks xmlns:a="http://schemas.openxmlformats.org/drawingml/2006/main" noChangeAspect="1"/>
+            </wp:cNvGraphicFramePr>
+            <a:graphic xmlns:a="http://schemas.openxmlformats.org/drawingml/2006/main">
+              <a:graphicData uri="http://schemas.openxmlformats.org/drawingml/2006/picture">
+                <pic:pic xmlns:pic="http://schemas.openxmlformats.org/drawingml/2006/picture">
+                  <pic:nvPicPr>
+                    <pic:cNvPr id="537622877" name="صورة 7">
+                      <a:hlinkClick r:id="rId9"/>
+                    </pic:cNvPr>
+                    <pic:cNvPicPr/>
+                  </pic:nvPicPr>
+                  <pic:blipFill>
+                    <a:blip r:embed="rId10">
+                      <a:extLst>
+                        <a:ext uri="{28A0092B-C50C-407E-A947-70E740481C1C}">
+                          <a14:useLocalDpi xmlns:a14="http://schemas.microsoft.com/office/drawing/2010/main" val="0"/>
+                        </a:ext>
+                      </a:extLst>
+                    </a:blip>
+                    <a:stretch>
+                      <a:fillRect/>
+                    </a:stretch>
+                  </pic:blipFill>
+                  <pic:spPr>
+                    <a:xfrm>
+                      <a:off x="0" y="0"/>
+                      <a:ext cx="7737465" cy="3080657"/>
+                    </a:xfrm>
+                    <a:prstGeom prst="rect">
+                      <a:avLst/>
+                    </a:prstGeom>
+                  </pic:spPr>
+                </pic:pic>
+              </a:graphicData>
+            </a:graphic>
+            <wp14:sizeRelH relativeFrom="page">
+              <wp14:pctWidth>0</wp14:pctWidth>
+            </wp14:sizeRelH>
+            <wp14:sizeRelV relativeFrom="page">
+              <wp14:pctHeight>0</wp14:pctHeight>
+            </wp14:sizeRelV>
+          </wp:anchor>
+        </w:drawing>
+      </w:r>
+      <w:r>
         <w:rPr>
           <w:sz w:val="36"/>
           <w:szCs w:val="36"/>
         </w:rPr>
-      </w:pPr>
-    </w:p>
-    <w:p>
-      <w:pPr>
-        <w:jc w:val="both"/>
-        <w:rPr>
-          <w:sz w:val="36"/>
-          <w:szCs w:val="36"/>
-        </w:rPr>
-      </w:pPr>
-    </w:p>
-    <w:p>
-      <w:pPr>
-        <w:jc w:val="both"/>
-        <w:rPr>
-          <w:sz w:val="36"/>
-          <w:szCs w:val="36"/>
-        </w:rPr>
-      </w:pPr>
-    </w:p>
-    <w:p>
-      <w:pPr>
-        <w:jc w:val="both"/>
-        <w:rPr>
-          <w:sz w:val="36"/>
-          <w:szCs w:val="36"/>
-        </w:rPr>
-      </w:pPr>
-    </w:p>
-    <w:p>
-      <w:pPr>
-        <w:jc w:val="both"/>
-        <w:rPr>
-          <w:sz w:val="36"/>
-          <w:szCs w:val="36"/>
-        </w:rPr>
-      </w:pPr>
-    </w:p>
-    <w:p>
-      <w:pPr>
-        <w:jc w:val="both"/>
-        <w:rPr>
-          <w:sz w:val="36"/>
-          <w:szCs w:val="36"/>
-        </w:rPr>
-      </w:pPr>
-    </w:p>
-    <w:p>
-      <w:pPr>
-        <w:jc w:val="both"/>
-        <w:rPr>
-          <w:sz w:val="36"/>
-          <w:szCs w:val="36"/>
-        </w:rPr>
-      </w:pPr>
-    </w:p>
-    <w:p>
-      <w:pPr>
-        <w:jc w:val="both"/>
-        <w:rPr>
-          <w:sz w:val="36"/>
-          <w:szCs w:val="36"/>
-        </w:rPr>
-      </w:pPr>
-    </w:p>
-    <w:p>
-      <w:pPr>
-        <w:jc w:val="both"/>
-        <w:rPr>
-          <w:sz w:val="36"/>
-          <w:szCs w:val="36"/>
-        </w:rPr>
-      </w:pPr>
-    </w:p>
-    <w:p>
-      <w:pPr>
-        <w:jc w:val="both"/>
-        <w:rPr>
-          <w:sz w:val="36"/>
-          <w:szCs w:val="36"/>
-        </w:rPr>
-      </w:pPr>
-    </w:p>
-    <w:p>
-      <w:pPr>
-        <w:jc w:val="both"/>
-        <w:rPr>
-          <w:sz w:val="36"/>
-          <w:szCs w:val="36"/>
-        </w:rPr>
-      </w:pPr>
-    </w:p>
-    <w:p>
-      <w:pPr>
-        <w:jc w:val="both"/>
-        <w:rPr>
-          <w:sz w:val="36"/>
-          <w:szCs w:val="36"/>
-        </w:rPr>
-      </w:pPr>
-    </w:p>
-    <w:p>
-      <w:pPr>
-        <w:jc w:val="both"/>
-        <w:rPr>
-          <w:sz w:val="36"/>
-          <w:szCs w:val="36"/>
-        </w:rPr>
-      </w:pPr>
-    </w:p>
-    <w:p>
-      <w:pPr>
-        <w:jc w:val="both"/>
-        <w:rPr>
-          <w:sz w:val="36"/>
-          <w:szCs w:val="36"/>
-        </w:rPr>
-      </w:pPr>
-    </w:p>
-    <w:p>
-      <w:pPr>
-        <w:jc w:val="both"/>
-        <w:rPr>
-          <w:sz w:val="36"/>
-          <w:szCs w:val="36"/>
-        </w:rPr>
-      </w:pPr>
-    </w:p>
-    <w:p>
-      <w:pPr>
-        <w:jc w:val="both"/>
-        <w:rPr>
-          <w:sz w:val="36"/>
-          <w:szCs w:val="36"/>
-        </w:rPr>
-      </w:pPr>
+        <w:br w:type="page"/>
+      </w:r>
     </w:p>
     <w:p>
       <w:pPr>
@@ -8075,6 +8002,82 @@
       </w:pPr>
       <w:r>
         <w:rPr>
+          <w:rFonts w:asciiTheme="majorHAnsi" w:eastAsiaTheme="majorEastAsia" w:hAnsiTheme="majorHAnsi" w:cstheme="majorBidi"/>
+          <w:noProof/>
+          <w:color w:val="2F5496" w:themeColor="accent1" w:themeShade="BF"/>
+          <w:sz w:val="36"/>
+          <w:szCs w:val="36"/>
+        </w:rPr>
+        <w:drawing>
+          <wp:anchor distT="0" distB="0" distL="114300" distR="114300" simplePos="0" relativeHeight="251662336" behindDoc="0" locked="0" layoutInCell="1" allowOverlap="1" wp14:anchorId="1E019380" wp14:editId="2DA015D2">
+            <wp:simplePos x="0" y="0"/>
+            <wp:positionH relativeFrom="margin">
+              <wp:align>center</wp:align>
+            </wp:positionH>
+            <wp:positionV relativeFrom="paragraph">
+              <wp:posOffset>404495</wp:posOffset>
+            </wp:positionV>
+            <wp:extent cx="7031355" cy="5975985"/>
+            <wp:effectExtent l="0" t="0" r="0" b="5715"/>
+            <wp:wrapThrough wrapText="bothSides">
+              <wp:wrapPolygon edited="0">
+                <wp:start x="0" y="0"/>
+                <wp:lineTo x="0" y="21552"/>
+                <wp:lineTo x="21536" y="21552"/>
+                <wp:lineTo x="21536" y="0"/>
+                <wp:lineTo x="0" y="0"/>
+              </wp:wrapPolygon>
+            </wp:wrapThrough>
+            <wp:docPr id="49411733" name="صورة 2">
+              <a:hlinkClick xmlns:a="http://schemas.openxmlformats.org/drawingml/2006/main" r:id="rId11"/>
+            </wp:docPr>
+            <wp:cNvGraphicFramePr>
+              <a:graphicFrameLocks xmlns:a="http://schemas.openxmlformats.org/drawingml/2006/main" noChangeAspect="1"/>
+            </wp:cNvGraphicFramePr>
+            <a:graphic xmlns:a="http://schemas.openxmlformats.org/drawingml/2006/main">
+              <a:graphicData uri="http://schemas.openxmlformats.org/drawingml/2006/picture">
+                <pic:pic xmlns:pic="http://schemas.openxmlformats.org/drawingml/2006/picture">
+                  <pic:nvPicPr>
+                    <pic:cNvPr id="49411733" name="صورة 2">
+                      <a:hlinkClick r:id="rId11"/>
+                    </pic:cNvPr>
+                    <pic:cNvPicPr/>
+                  </pic:nvPicPr>
+                  <pic:blipFill>
+                    <a:blip r:embed="rId12" cstate="print">
+                      <a:extLst>
+                        <a:ext uri="{28A0092B-C50C-407E-A947-70E740481C1C}">
+                          <a14:useLocalDpi xmlns:a14="http://schemas.microsoft.com/office/drawing/2010/main" val="0"/>
+                        </a:ext>
+                      </a:extLst>
+                    </a:blip>
+                    <a:stretch>
+                      <a:fillRect/>
+                    </a:stretch>
+                  </pic:blipFill>
+                  <pic:spPr>
+                    <a:xfrm>
+                      <a:off x="0" y="0"/>
+                      <a:ext cx="7031355" cy="5975985"/>
+                    </a:xfrm>
+                    <a:prstGeom prst="rect">
+                      <a:avLst/>
+                    </a:prstGeom>
+                  </pic:spPr>
+                </pic:pic>
+              </a:graphicData>
+            </a:graphic>
+            <wp14:sizeRelH relativeFrom="page">
+              <wp14:pctWidth>0</wp14:pctWidth>
+            </wp14:sizeRelH>
+            <wp14:sizeRelV relativeFrom="page">
+              <wp14:pctHeight>0</wp14:pctHeight>
+            </wp14:sizeRelV>
+          </wp:anchor>
+        </w:drawing>
+      </w:r>
+      <w:r>
+        <w:rPr>
           <w:sz w:val="36"/>
           <w:szCs w:val="36"/>
         </w:rPr>
@@ -8123,6 +8126,82 @@
       </w:pPr>
       <w:r>
         <w:rPr>
+          <w:rFonts w:asciiTheme="majorHAnsi" w:eastAsiaTheme="majorEastAsia" w:hAnsiTheme="majorHAnsi" w:cstheme="majorBidi"/>
+          <w:noProof/>
+          <w:color w:val="2F5496" w:themeColor="accent1" w:themeShade="BF"/>
+          <w:sz w:val="36"/>
+          <w:szCs w:val="36"/>
+        </w:rPr>
+        <w:drawing>
+          <wp:anchor distT="0" distB="0" distL="114300" distR="114300" simplePos="0" relativeHeight="251663360" behindDoc="0" locked="0" layoutInCell="1" allowOverlap="1" wp14:anchorId="33251CF7" wp14:editId="2FB77F6C">
+            <wp:simplePos x="0" y="0"/>
+            <wp:positionH relativeFrom="margin">
+              <wp:align>center</wp:align>
+            </wp:positionH>
+            <wp:positionV relativeFrom="paragraph">
+              <wp:posOffset>479970</wp:posOffset>
+            </wp:positionV>
+            <wp:extent cx="7112000" cy="6737985"/>
+            <wp:effectExtent l="0" t="0" r="0" b="5715"/>
+            <wp:wrapThrough wrapText="bothSides">
+              <wp:wrapPolygon edited="0">
+                <wp:start x="0" y="0"/>
+                <wp:lineTo x="0" y="21557"/>
+                <wp:lineTo x="21523" y="21557"/>
+                <wp:lineTo x="21523" y="0"/>
+                <wp:lineTo x="0" y="0"/>
+              </wp:wrapPolygon>
+            </wp:wrapThrough>
+            <wp:docPr id="1944908979" name="صورة 3">
+              <a:hlinkClick xmlns:a="http://schemas.openxmlformats.org/drawingml/2006/main" r:id="rId13"/>
+            </wp:docPr>
+            <wp:cNvGraphicFramePr>
+              <a:graphicFrameLocks xmlns:a="http://schemas.openxmlformats.org/drawingml/2006/main" noChangeAspect="1"/>
+            </wp:cNvGraphicFramePr>
+            <a:graphic xmlns:a="http://schemas.openxmlformats.org/drawingml/2006/main">
+              <a:graphicData uri="http://schemas.openxmlformats.org/drawingml/2006/picture">
+                <pic:pic xmlns:pic="http://schemas.openxmlformats.org/drawingml/2006/picture">
+                  <pic:nvPicPr>
+                    <pic:cNvPr id="1944908979" name="صورة 3">
+                      <a:hlinkClick r:id="rId13"/>
+                    </pic:cNvPr>
+                    <pic:cNvPicPr/>
+                  </pic:nvPicPr>
+                  <pic:blipFill>
+                    <a:blip r:embed="rId14" cstate="print">
+                      <a:extLst>
+                        <a:ext uri="{28A0092B-C50C-407E-A947-70E740481C1C}">
+                          <a14:useLocalDpi xmlns:a14="http://schemas.microsoft.com/office/drawing/2010/main" val="0"/>
+                        </a:ext>
+                      </a:extLst>
+                    </a:blip>
+                    <a:stretch>
+                      <a:fillRect/>
+                    </a:stretch>
+                  </pic:blipFill>
+                  <pic:spPr>
+                    <a:xfrm>
+                      <a:off x="0" y="0"/>
+                      <a:ext cx="7112000" cy="6737985"/>
+                    </a:xfrm>
+                    <a:prstGeom prst="rect">
+                      <a:avLst/>
+                    </a:prstGeom>
+                  </pic:spPr>
+                </pic:pic>
+              </a:graphicData>
+            </a:graphic>
+            <wp14:sizeRelH relativeFrom="page">
+              <wp14:pctWidth>0</wp14:pctWidth>
+            </wp14:sizeRelH>
+            <wp14:sizeRelV relativeFrom="page">
+              <wp14:pctHeight>0</wp14:pctHeight>
+            </wp14:sizeRelV>
+          </wp:anchor>
+        </w:drawing>
+      </w:r>
+      <w:r>
+        <w:rPr>
           <w:sz w:val="36"/>
           <w:szCs w:val="36"/>
         </w:rPr>
@@ -8171,6 +8250,82 @@
       </w:pPr>
       <w:r>
         <w:rPr>
+          <w:rFonts w:asciiTheme="majorHAnsi" w:eastAsiaTheme="majorEastAsia" w:hAnsiTheme="majorHAnsi" w:cstheme="majorBidi"/>
+          <w:noProof/>
+          <w:color w:val="2F5496" w:themeColor="accent1" w:themeShade="BF"/>
+          <w:sz w:val="36"/>
+          <w:szCs w:val="36"/>
+        </w:rPr>
+        <w:drawing>
+          <wp:anchor distT="0" distB="0" distL="114300" distR="114300" simplePos="0" relativeHeight="251664384" behindDoc="0" locked="0" layoutInCell="1" allowOverlap="1" wp14:anchorId="0168415F" wp14:editId="1C6A291A">
+            <wp:simplePos x="0" y="0"/>
+            <wp:positionH relativeFrom="margin">
+              <wp:align>center</wp:align>
+            </wp:positionH>
+            <wp:positionV relativeFrom="paragraph">
+              <wp:posOffset>518250</wp:posOffset>
+            </wp:positionV>
+            <wp:extent cx="7426960" cy="4816475"/>
+            <wp:effectExtent l="0" t="0" r="2540" b="3175"/>
+            <wp:wrapThrough wrapText="bothSides">
+              <wp:wrapPolygon edited="0">
+                <wp:start x="0" y="0"/>
+                <wp:lineTo x="0" y="21529"/>
+                <wp:lineTo x="21552" y="21529"/>
+                <wp:lineTo x="21552" y="0"/>
+                <wp:lineTo x="0" y="0"/>
+              </wp:wrapPolygon>
+            </wp:wrapThrough>
+            <wp:docPr id="13515436" name="صورة 4">
+              <a:hlinkClick xmlns:a="http://schemas.openxmlformats.org/drawingml/2006/main" r:id="rId15"/>
+            </wp:docPr>
+            <wp:cNvGraphicFramePr>
+              <a:graphicFrameLocks xmlns:a="http://schemas.openxmlformats.org/drawingml/2006/main" noChangeAspect="1"/>
+            </wp:cNvGraphicFramePr>
+            <a:graphic xmlns:a="http://schemas.openxmlformats.org/drawingml/2006/main">
+              <a:graphicData uri="http://schemas.openxmlformats.org/drawingml/2006/picture">
+                <pic:pic xmlns:pic="http://schemas.openxmlformats.org/drawingml/2006/picture">
+                  <pic:nvPicPr>
+                    <pic:cNvPr id="13515436" name="صورة 4">
+                      <a:hlinkClick r:id="rId15"/>
+                    </pic:cNvPr>
+                    <pic:cNvPicPr/>
+                  </pic:nvPicPr>
+                  <pic:blipFill>
+                    <a:blip r:embed="rId16" cstate="print">
+                      <a:extLst>
+                        <a:ext uri="{28A0092B-C50C-407E-A947-70E740481C1C}">
+                          <a14:useLocalDpi xmlns:a14="http://schemas.microsoft.com/office/drawing/2010/main" val="0"/>
+                        </a:ext>
+                      </a:extLst>
+                    </a:blip>
+                    <a:stretch>
+                      <a:fillRect/>
+                    </a:stretch>
+                  </pic:blipFill>
+                  <pic:spPr>
+                    <a:xfrm>
+                      <a:off x="0" y="0"/>
+                      <a:ext cx="7426960" cy="4816475"/>
+                    </a:xfrm>
+                    <a:prstGeom prst="rect">
+                      <a:avLst/>
+                    </a:prstGeom>
+                  </pic:spPr>
+                </pic:pic>
+              </a:graphicData>
+            </a:graphic>
+            <wp14:sizeRelH relativeFrom="page">
+              <wp14:pctWidth>0</wp14:pctWidth>
+            </wp14:sizeRelH>
+            <wp14:sizeRelV relativeFrom="page">
+              <wp14:pctHeight>0</wp14:pctHeight>
+            </wp14:sizeRelV>
+          </wp:anchor>
+        </w:drawing>
+      </w:r>
+      <w:r>
+        <w:rPr>
           <w:sz w:val="36"/>
           <w:szCs w:val="36"/>
         </w:rPr>
@@ -8220,7 +8375,7 @@
           <w:szCs w:val="48"/>
         </w:rPr>
         <w:drawing>
-          <wp:anchor distT="0" distB="0" distL="114300" distR="114300" simplePos="0" relativeHeight="251660288" behindDoc="0" locked="0" layoutInCell="1" allowOverlap="1" wp14:anchorId="60525707" wp14:editId="1E5A2F49">
+          <wp:anchor distT="0" distB="0" distL="114300" distR="114300" simplePos="0" relativeHeight="251660288" behindDoc="0" locked="0" layoutInCell="1" allowOverlap="1" wp14:anchorId="60525707" wp14:editId="2DA6BE70">
             <wp:simplePos x="0" y="0"/>
             <wp:positionH relativeFrom="column">
               <wp:posOffset>595563</wp:posOffset>
@@ -8239,7 +8394,9 @@
                 <wp:lineTo x="0" y="0"/>
               </wp:wrapPolygon>
             </wp:wrapThrough>
-            <wp:docPr id="977423960" name="صورة 2"/>
+            <wp:docPr id="977423960" name="صورة 2">
+              <a:hlinkClick xmlns:a="http://schemas.openxmlformats.org/drawingml/2006/main" r:id="rId17"/>
+            </wp:docPr>
             <wp:cNvGraphicFramePr>
               <a:graphicFrameLocks xmlns:a="http://schemas.openxmlformats.org/drawingml/2006/main" noChangeAspect="1"/>
             </wp:cNvGraphicFramePr>
@@ -8247,11 +8404,13 @@
               <a:graphicData uri="http://schemas.openxmlformats.org/drawingml/2006/picture">
                 <pic:pic xmlns:pic="http://schemas.openxmlformats.org/drawingml/2006/picture">
                   <pic:nvPicPr>
-                    <pic:cNvPr id="977423960" name="صورة 977423960"/>
+                    <pic:cNvPr id="977423960" name="صورة 2">
+                      <a:hlinkClick r:id="rId17"/>
+                    </pic:cNvPr>
                     <pic:cNvPicPr/>
                   </pic:nvPicPr>
                   <pic:blipFill>
-                    <a:blip r:embed="rId9">
+                    <a:blip r:embed="rId18">
                       <a:extLst>
                         <a:ext uri="{28A0092B-C50C-407E-A947-70E740481C1C}">
                           <a14:useLocalDpi xmlns:a14="http://schemas.microsoft.com/office/drawing/2010/main" val="0"/>
@@ -8327,6 +8486,78 @@
       </w:pPr>
       <w:r>
         <w:rPr>
+          <w:rFonts w:asciiTheme="majorHAnsi" w:eastAsiaTheme="majorEastAsia" w:hAnsiTheme="majorHAnsi" w:cstheme="majorBidi"/>
+          <w:noProof/>
+          <w:color w:val="2F5496" w:themeColor="accent1" w:themeShade="BF"/>
+          <w:sz w:val="44"/>
+          <w:szCs w:val="44"/>
+        </w:rPr>
+        <w:drawing>
+          <wp:anchor distT="0" distB="0" distL="114300" distR="114300" simplePos="0" relativeHeight="251666432" behindDoc="0" locked="0" layoutInCell="1" allowOverlap="1" wp14:anchorId="2D1D653F" wp14:editId="1DF6D35B">
+            <wp:simplePos x="0" y="0"/>
+            <wp:positionH relativeFrom="margin">
+              <wp:align>center</wp:align>
+            </wp:positionH>
+            <wp:positionV relativeFrom="paragraph">
+              <wp:posOffset>529227</wp:posOffset>
+            </wp:positionV>
+            <wp:extent cx="7387469" cy="3869871"/>
+            <wp:effectExtent l="0" t="0" r="4445" b="0"/>
+            <wp:wrapThrough wrapText="bothSides">
+              <wp:wrapPolygon edited="0">
+                <wp:start x="0" y="0"/>
+                <wp:lineTo x="0" y="21479"/>
+                <wp:lineTo x="21557" y="21479"/>
+                <wp:lineTo x="21557" y="0"/>
+                <wp:lineTo x="0" y="0"/>
+              </wp:wrapPolygon>
+            </wp:wrapThrough>
+            <wp:docPr id="88275271" name="صورة 8"/>
+            <wp:cNvGraphicFramePr>
+              <a:graphicFrameLocks xmlns:a="http://schemas.openxmlformats.org/drawingml/2006/main" noChangeAspect="1"/>
+            </wp:cNvGraphicFramePr>
+            <a:graphic xmlns:a="http://schemas.openxmlformats.org/drawingml/2006/main">
+              <a:graphicData uri="http://schemas.openxmlformats.org/drawingml/2006/picture">
+                <pic:pic xmlns:pic="http://schemas.openxmlformats.org/drawingml/2006/picture">
+                  <pic:nvPicPr>
+                    <pic:cNvPr id="88275271" name="صورة 88275271"/>
+                    <pic:cNvPicPr/>
+                  </pic:nvPicPr>
+                  <pic:blipFill>
+                    <a:blip r:embed="rId19">
+                      <a:extLst>
+                        <a:ext uri="{28A0092B-C50C-407E-A947-70E740481C1C}">
+                          <a14:useLocalDpi xmlns:a14="http://schemas.microsoft.com/office/drawing/2010/main" val="0"/>
+                        </a:ext>
+                      </a:extLst>
+                    </a:blip>
+                    <a:stretch>
+                      <a:fillRect/>
+                    </a:stretch>
+                  </pic:blipFill>
+                  <pic:spPr>
+                    <a:xfrm>
+                      <a:off x="0" y="0"/>
+                      <a:ext cx="7387469" cy="3869871"/>
+                    </a:xfrm>
+                    <a:prstGeom prst="rect">
+                      <a:avLst/>
+                    </a:prstGeom>
+                  </pic:spPr>
+                </pic:pic>
+              </a:graphicData>
+            </a:graphic>
+            <wp14:sizeRelH relativeFrom="page">
+              <wp14:pctWidth>0</wp14:pctWidth>
+            </wp14:sizeRelH>
+            <wp14:sizeRelV relativeFrom="page">
+              <wp14:pctHeight>0</wp14:pctHeight>
+            </wp14:sizeRelV>
+          </wp:anchor>
+        </w:drawing>
+      </w:r>
+      <w:r>
+        <w:rPr>
           <w:sz w:val="44"/>
           <w:szCs w:val="44"/>
         </w:rPr>
@@ -8514,7 +8745,7 @@
               </wp:wrapPolygon>
             </wp:wrapThrough>
             <wp:docPr id="1957838777" name="صورة 1">
-              <a:hlinkClick xmlns:a="http://schemas.openxmlformats.org/drawingml/2006/main" r:id="rId10"/>
+              <a:hlinkClick xmlns:a="http://schemas.openxmlformats.org/drawingml/2006/main" r:id="rId20"/>
             </wp:docPr>
             <wp:cNvGraphicFramePr>
               <a:graphicFrameLocks xmlns:a="http://schemas.openxmlformats.org/drawingml/2006/main" noChangeAspect="1"/>
@@ -8524,12 +8755,12 @@
                 <pic:pic xmlns:pic="http://schemas.openxmlformats.org/drawingml/2006/picture">
                   <pic:nvPicPr>
                     <pic:cNvPr id="1957838777" name="صورة 1">
-                      <a:hlinkClick r:id="rId10"/>
+                      <a:hlinkClick r:id="rId20"/>
                     </pic:cNvPr>
                     <pic:cNvPicPr/>
                   </pic:nvPicPr>
                   <pic:blipFill>
-                    <a:blip r:embed="rId11" cstate="print">
+                    <a:blip r:embed="rId21" cstate="print">
                       <a:extLst>
                         <a:ext uri="{28A0092B-C50C-407E-A947-70E740481C1C}">
                           <a14:useLocalDpi xmlns:a14="http://schemas.microsoft.com/office/drawing/2010/main" val="0"/>
@@ -9291,6 +9522,14 @@
                 <w:szCs w:val="32"/>
               </w:rPr>
             </w:pPr>
+            <w:r>
+              <w:rPr>
+                <w:rFonts w:ascii="Segoe UI Emoji" w:hAnsi="Segoe UI Emoji" w:cs="Segoe UI Emoji"/>
+                <w:sz w:val="32"/>
+                <w:szCs w:val="32"/>
+              </w:rPr>
+              <w:t>✅</w:t>
+            </w:r>
           </w:p>
         </w:tc>
       </w:tr>
@@ -9643,6 +9882,359 @@
               </w:rPr>
               <w:t>April</w:t>
             </w:r>
+          </w:p>
+        </w:tc>
+        <w:tc>
+          <w:tcPr>
+            <w:tcW w:w="1144" w:type="dxa"/>
+          </w:tcPr>
+          <w:p>
+            <w:pPr>
+              <w:jc w:val="center"/>
+              <w:rPr>
+                <w:sz w:val="32"/>
+                <w:szCs w:val="32"/>
+              </w:rPr>
+            </w:pPr>
+            <w:r>
+              <w:rPr>
+                <w:rFonts w:ascii="Segoe UI Emoji" w:hAnsi="Segoe UI Emoji" w:cs="Segoe UI Emoji"/>
+                <w:sz w:val="32"/>
+                <w:szCs w:val="32"/>
+              </w:rPr>
+              <w:t>✅</w:t>
+            </w:r>
+          </w:p>
+        </w:tc>
+      </w:tr>
+      <w:tr>
+        <w:tc>
+          <w:tcPr>
+            <w:tcW w:w="720" w:type="dxa"/>
+          </w:tcPr>
+          <w:p>
+            <w:pPr>
+              <w:jc w:val="center"/>
+              <w:rPr>
+                <w:b/>
+                <w:bCs/>
+                <w:sz w:val="32"/>
+                <w:szCs w:val="32"/>
+              </w:rPr>
+            </w:pPr>
+            <w:r>
+              <w:rPr>
+                <w:b/>
+                <w:bCs/>
+                <w:sz w:val="32"/>
+                <w:szCs w:val="32"/>
+              </w:rPr>
+              <w:t>T6</w:t>
+            </w:r>
+          </w:p>
+        </w:tc>
+        <w:tc>
+          <w:tcPr>
+            <w:tcW w:w="3420" w:type="dxa"/>
+          </w:tcPr>
+          <w:p>
+            <w:pPr>
+              <w:jc w:val="mediumKashida"/>
+              <w:rPr>
+                <w:b/>
+                <w:bCs/>
+                <w:sz w:val="28"/>
+                <w:szCs w:val="28"/>
+              </w:rPr>
+            </w:pPr>
+            <w:r>
+              <w:rPr>
+                <w:b/>
+                <w:bCs/>
+                <w:sz w:val="28"/>
+                <w:szCs w:val="28"/>
+              </w:rPr>
+              <w:t>use case diagram</w:t>
+            </w:r>
+          </w:p>
+        </w:tc>
+        <w:tc>
+          <w:tcPr>
+            <w:tcW w:w="1710" w:type="dxa"/>
+          </w:tcPr>
+          <w:p>
+            <w:pPr>
+              <w:jc w:val="mediumKashida"/>
+              <w:rPr>
+                <w:sz w:val="32"/>
+                <w:szCs w:val="32"/>
+              </w:rPr>
+            </w:pPr>
+            <w:r>
+              <w:rPr>
+                <w:sz w:val="32"/>
+                <w:szCs w:val="32"/>
+              </w:rPr>
+              <w:t>Yazan</w:t>
+            </w:r>
+          </w:p>
+        </w:tc>
+        <w:tc>
+          <w:tcPr>
+            <w:tcW w:w="1641" w:type="dxa"/>
+            <w:vMerge/>
+          </w:tcPr>
+          <w:p>
+            <w:pPr>
+              <w:jc w:val="center"/>
+              <w:rPr>
+                <w:sz w:val="32"/>
+                <w:szCs w:val="32"/>
+              </w:rPr>
+            </w:pPr>
+          </w:p>
+        </w:tc>
+        <w:tc>
+          <w:tcPr>
+            <w:tcW w:w="1144" w:type="dxa"/>
+          </w:tcPr>
+          <w:p>
+            <w:pPr>
+              <w:jc w:val="center"/>
+              <w:rPr>
+                <w:sz w:val="32"/>
+                <w:szCs w:val="32"/>
+              </w:rPr>
+            </w:pPr>
+            <w:r>
+              <w:rPr>
+                <w:rFonts w:ascii="Segoe UI Emoji" w:hAnsi="Segoe UI Emoji" w:cs="Segoe UI Emoji"/>
+                <w:sz w:val="32"/>
+                <w:szCs w:val="32"/>
+              </w:rPr>
+              <w:t>✅</w:t>
+            </w:r>
+          </w:p>
+        </w:tc>
+      </w:tr>
+      <w:tr>
+        <w:tc>
+          <w:tcPr>
+            <w:tcW w:w="720" w:type="dxa"/>
+          </w:tcPr>
+          <w:p>
+            <w:pPr>
+              <w:jc w:val="center"/>
+              <w:rPr>
+                <w:b/>
+                <w:bCs/>
+                <w:sz w:val="32"/>
+                <w:szCs w:val="32"/>
+              </w:rPr>
+            </w:pPr>
+            <w:r>
+              <w:rPr>
+                <w:b/>
+                <w:bCs/>
+                <w:sz w:val="32"/>
+                <w:szCs w:val="32"/>
+              </w:rPr>
+              <w:t>T7</w:t>
+            </w:r>
+          </w:p>
+        </w:tc>
+        <w:tc>
+          <w:tcPr>
+            <w:tcW w:w="3420" w:type="dxa"/>
+          </w:tcPr>
+          <w:p>
+            <w:pPr>
+              <w:jc w:val="mediumKashida"/>
+              <w:rPr>
+                <w:b/>
+                <w:bCs/>
+                <w:sz w:val="28"/>
+                <w:szCs w:val="28"/>
+              </w:rPr>
+            </w:pPr>
+            <w:r>
+              <w:rPr>
+                <w:b/>
+                <w:bCs/>
+                <w:sz w:val="28"/>
+                <w:szCs w:val="28"/>
+              </w:rPr>
+              <w:t>Context model</w:t>
+            </w:r>
+          </w:p>
+        </w:tc>
+        <w:tc>
+          <w:tcPr>
+            <w:tcW w:w="1710" w:type="dxa"/>
+          </w:tcPr>
+          <w:p>
+            <w:pPr>
+              <w:jc w:val="mediumKashida"/>
+              <w:rPr>
+                <w:sz w:val="32"/>
+                <w:szCs w:val="32"/>
+              </w:rPr>
+            </w:pPr>
+            <w:r>
+              <w:rPr>
+                <w:sz w:val="32"/>
+                <w:szCs w:val="32"/>
+              </w:rPr>
+              <w:t>Basem</w:t>
+            </w:r>
+          </w:p>
+        </w:tc>
+        <w:tc>
+          <w:tcPr>
+            <w:tcW w:w="1641" w:type="dxa"/>
+            <w:vMerge/>
+          </w:tcPr>
+          <w:p>
+            <w:pPr>
+              <w:jc w:val="center"/>
+              <w:rPr>
+                <w:sz w:val="32"/>
+                <w:szCs w:val="32"/>
+              </w:rPr>
+            </w:pPr>
+          </w:p>
+        </w:tc>
+        <w:tc>
+          <w:tcPr>
+            <w:tcW w:w="1144" w:type="dxa"/>
+          </w:tcPr>
+          <w:p>
+            <w:pPr>
+              <w:jc w:val="center"/>
+              <w:rPr>
+                <w:sz w:val="32"/>
+                <w:szCs w:val="32"/>
+              </w:rPr>
+            </w:pPr>
+            <w:r>
+              <w:rPr>
+                <w:rFonts w:ascii="Segoe UI Emoji" w:hAnsi="Segoe UI Emoji" w:cs="Segoe UI Emoji"/>
+                <w:sz w:val="32"/>
+                <w:szCs w:val="32"/>
+              </w:rPr>
+              <w:t>✅</w:t>
+            </w:r>
+          </w:p>
+        </w:tc>
+      </w:tr>
+      <w:tr>
+        <w:tc>
+          <w:tcPr>
+            <w:tcW w:w="720" w:type="dxa"/>
+          </w:tcPr>
+          <w:p>
+            <w:pPr>
+              <w:jc w:val="center"/>
+              <w:rPr>
+                <w:b/>
+                <w:bCs/>
+                <w:sz w:val="32"/>
+                <w:szCs w:val="32"/>
+              </w:rPr>
+            </w:pPr>
+            <w:r>
+              <w:rPr>
+                <w:b/>
+                <w:bCs/>
+                <w:sz w:val="32"/>
+                <w:szCs w:val="32"/>
+              </w:rPr>
+              <w:t>T8</w:t>
+            </w:r>
+          </w:p>
+        </w:tc>
+        <w:tc>
+          <w:tcPr>
+            <w:tcW w:w="3420" w:type="dxa"/>
+          </w:tcPr>
+          <w:p>
+            <w:pPr>
+              <w:jc w:val="mediumKashida"/>
+              <w:rPr>
+                <w:b/>
+                <w:bCs/>
+                <w:sz w:val="28"/>
+                <w:szCs w:val="28"/>
+              </w:rPr>
+            </w:pPr>
+            <w:r>
+              <w:rPr>
+                <w:b/>
+                <w:bCs/>
+                <w:sz w:val="28"/>
+                <w:szCs w:val="28"/>
+              </w:rPr>
+              <w:t>Sequence diagrams</w:t>
+            </w:r>
+          </w:p>
+          <w:p>
+            <w:pPr>
+              <w:jc w:val="mediumKashida"/>
+              <w:rPr>
+                <w:b/>
+                <w:bCs/>
+                <w:sz w:val="28"/>
+                <w:szCs w:val="28"/>
+              </w:rPr>
+            </w:pPr>
+            <w:r>
+              <w:rPr>
+                <w:b/>
+                <w:bCs/>
+                <w:sz w:val="28"/>
+                <w:szCs w:val="28"/>
+              </w:rPr>
+              <w:t>(customer, employee &amp; manager)</w:t>
+            </w:r>
+          </w:p>
+        </w:tc>
+        <w:tc>
+          <w:tcPr>
+            <w:tcW w:w="1710" w:type="dxa"/>
+          </w:tcPr>
+          <w:p>
+            <w:pPr>
+              <w:jc w:val="mediumKashida"/>
+              <w:rPr>
+                <w:strike/>
+                <w:sz w:val="32"/>
+                <w:szCs w:val="32"/>
+              </w:rPr>
+            </w:pPr>
+            <w:r>
+              <w:rPr>
+                <w:strike/>
+                <w:color w:val="EE0000"/>
+                <w:sz w:val="32"/>
+                <w:szCs w:val="32"/>
+              </w:rPr>
+              <w:t>Hussain</w:t>
+            </w:r>
+          </w:p>
+        </w:tc>
+        <w:tc>
+          <w:tcPr>
+            <w:tcW w:w="1641" w:type="dxa"/>
+            <w:vMerge/>
+          </w:tcPr>
+          <w:p>
+            <w:pPr>
+              <w:jc w:val="center"/>
+              <w:rPr>
+                <w:sz w:val="32"/>
+                <w:szCs w:val="32"/>
+              </w:rPr>
+            </w:pPr>
           </w:p>
         </w:tc>
         <w:tc>
@@ -9682,7 +10274,7 @@
                 <w:sz w:val="32"/>
                 <w:szCs w:val="32"/>
               </w:rPr>
-              <w:t>T6</w:t>
+              <w:t>T9</w:t>
             </w:r>
           </w:p>
         </w:tc>
@@ -9707,7 +10299,7 @@
                 <w:sz w:val="28"/>
                 <w:szCs w:val="28"/>
               </w:rPr>
-              <w:t>use case diagram</w:t>
+              <w:t>Class diagram</w:t>
             </w:r>
           </w:p>
         </w:tc>
@@ -9728,14 +10320,13 @@
                 <w:sz w:val="32"/>
                 <w:szCs w:val="32"/>
               </w:rPr>
-              <w:t>Yazan</w:t>
+              <w:t xml:space="preserve">Reda </w:t>
             </w:r>
           </w:p>
         </w:tc>
         <w:tc>
           <w:tcPr>
             <w:tcW w:w="1641" w:type="dxa"/>
-            <w:vMerge/>
           </w:tcPr>
           <w:p>
             <w:pPr>
@@ -9745,6 +10336,41 @@
                 <w:szCs w:val="32"/>
               </w:rPr>
             </w:pPr>
+            <w:r>
+              <w:rPr>
+                <w:rFonts w:ascii="Calibri" w:hAnsi="Calibri" w:cs="Calibri"/>
+                <w:color w:val="212121"/>
+                <w:sz w:val="32"/>
+                <w:szCs w:val="32"/>
+              </w:rPr>
+              <w:t>20</w:t>
+            </w:r>
+            <w:r>
+              <w:rPr>
+                <w:rFonts w:ascii="Calibri" w:hAnsi="Calibri" w:cs="Calibri"/>
+                <w:color w:val="212121"/>
+                <w:sz w:val="32"/>
+                <w:szCs w:val="32"/>
+                <w:vertAlign w:val="superscript"/>
+              </w:rPr>
+              <w:t>th</w:t>
+            </w:r>
+            <w:r>
+              <w:rPr>
+                <w:rFonts w:ascii="Calibri" w:hAnsi="Calibri" w:cs="Calibri"/>
+                <w:color w:val="212121"/>
+                <w:sz w:val="32"/>
+                <w:szCs w:val="32"/>
+              </w:rPr>
+              <w:t xml:space="preserve"> </w:t>
+            </w:r>
+            <w:r>
+              <w:rPr>
+                <w:sz w:val="32"/>
+                <w:szCs w:val="32"/>
+              </w:rPr>
+              <w:t>April</w:t>
+            </w:r>
           </w:p>
         </w:tc>
         <w:tc>
@@ -9792,7 +10418,7 @@
                 <w:sz w:val="32"/>
                 <w:szCs w:val="32"/>
               </w:rPr>
-              <w:t>T7</w:t>
+              <w:t>T10</w:t>
             </w:r>
           </w:p>
         </w:tc>
@@ -9817,7 +10443,7 @@
                 <w:sz w:val="28"/>
                 <w:szCs w:val="28"/>
               </w:rPr>
-              <w:t>Context model</w:t>
+              <w:t>State machine diagram</w:t>
             </w:r>
           </w:p>
         </w:tc>
@@ -9829,32 +10455,112 @@
             <w:pPr>
               <w:jc w:val="mediumKashida"/>
               <w:rPr>
+                <w:strike/>
                 <w:sz w:val="32"/>
                 <w:szCs w:val="32"/>
               </w:rPr>
             </w:pPr>
             <w:r>
               <w:rPr>
-                <w:sz w:val="32"/>
-                <w:szCs w:val="32"/>
-              </w:rPr>
-              <w:t>Basem</w:t>
+                <w:strike/>
+                <w:color w:val="EE0000"/>
+                <w:sz w:val="32"/>
+                <w:szCs w:val="32"/>
+              </w:rPr>
+              <w:t>Hussain</w:t>
             </w:r>
           </w:p>
         </w:tc>
         <w:tc>
           <w:tcPr>
             <w:tcW w:w="1641" w:type="dxa"/>
-            <w:vMerge/>
+            <w:vMerge w:val="restart"/>
           </w:tcPr>
           <w:p>
             <w:pPr>
               <w:jc w:val="center"/>
               <w:rPr>
+                <w:rFonts w:ascii="Calibri" w:hAnsi="Calibri" w:cs="Calibri"/>
+                <w:color w:val="212121"/>
                 <w:sz w:val="32"/>
                 <w:szCs w:val="32"/>
               </w:rPr>
             </w:pPr>
+          </w:p>
+          <w:p>
+            <w:pPr>
+              <w:jc w:val="center"/>
+              <w:rPr>
+                <w:rFonts w:ascii="Calibri" w:hAnsi="Calibri" w:cs="Calibri"/>
+                <w:color w:val="212121"/>
+                <w:sz w:val="32"/>
+                <w:szCs w:val="32"/>
+              </w:rPr>
+            </w:pPr>
+          </w:p>
+          <w:p>
+            <w:pPr>
+              <w:jc w:val="center"/>
+              <w:rPr>
+                <w:rFonts w:ascii="Calibri" w:hAnsi="Calibri" w:cs="Calibri"/>
+                <w:color w:val="212121"/>
+                <w:sz w:val="32"/>
+                <w:szCs w:val="32"/>
+              </w:rPr>
+            </w:pPr>
+          </w:p>
+          <w:p>
+            <w:pPr>
+              <w:jc w:val="center"/>
+              <w:rPr>
+                <w:sz w:val="32"/>
+                <w:szCs w:val="32"/>
+              </w:rPr>
+            </w:pPr>
+            <w:r>
+              <w:rPr>
+                <w:rFonts w:ascii="Calibri" w:hAnsi="Calibri" w:cs="Calibri"/>
+                <w:color w:val="212121"/>
+                <w:sz w:val="32"/>
+                <w:szCs w:val="32"/>
+              </w:rPr>
+              <w:t>2</w:t>
+            </w:r>
+            <w:r>
+              <w:rPr>
+                <w:rFonts w:ascii="Calibri" w:hAnsi="Calibri" w:cs="Calibri"/>
+                <w:color w:val="212121"/>
+                <w:sz w:val="32"/>
+                <w:szCs w:val="32"/>
+              </w:rPr>
+              <w:t>1</w:t>
+            </w:r>
+            <w:r>
+              <w:rPr>
+                <w:rFonts w:ascii="Calibri" w:hAnsi="Calibri" w:cs="Calibri"/>
+                <w:color w:val="212121"/>
+                <w:sz w:val="32"/>
+                <w:szCs w:val="32"/>
+                <w:vertAlign w:val="superscript"/>
+              </w:rPr>
+              <w:t>th</w:t>
+            </w:r>
+            <w:r>
+              <w:rPr>
+                <w:rFonts w:ascii="Calibri" w:hAnsi="Calibri" w:cs="Calibri"/>
+                <w:color w:val="212121"/>
+                <w:sz w:val="32"/>
+                <w:szCs w:val="32"/>
+              </w:rPr>
+              <w:t xml:space="preserve"> </w:t>
+            </w:r>
+            <w:r>
+              <w:rPr>
+                <w:sz w:val="32"/>
+                <w:szCs w:val="32"/>
+              </w:rPr>
+              <w:t>April</w:t>
+            </w:r>
           </w:p>
         </w:tc>
         <w:tc>
@@ -9894,7 +10600,7 @@
                 <w:sz w:val="32"/>
                 <w:szCs w:val="32"/>
               </w:rPr>
-              <w:t>T8</w:t>
+              <w:t>T11</w:t>
             </w:r>
           </w:p>
         </w:tc>
@@ -9919,27 +10625,7 @@
                 <w:sz w:val="28"/>
                 <w:szCs w:val="28"/>
               </w:rPr>
-              <w:t>Sequence diagrams</w:t>
-            </w:r>
-          </w:p>
-          <w:p>
-            <w:pPr>
-              <w:jc w:val="mediumKashida"/>
-              <w:rPr>
-                <w:b/>
-                <w:bCs/>
-                <w:sz w:val="28"/>
-                <w:szCs w:val="28"/>
-              </w:rPr>
-            </w:pPr>
-            <w:r>
-              <w:rPr>
-                <w:b/>
-                <w:bCs/>
-                <w:sz w:val="28"/>
-                <w:szCs w:val="28"/>
-              </w:rPr>
-              <w:t>(customer, employee &amp; manager)</w:t>
+              <w:t>Test cases</w:t>
             </w:r>
           </w:p>
         </w:tc>
@@ -9960,7 +10646,7 @@
                 <w:sz w:val="32"/>
                 <w:szCs w:val="32"/>
               </w:rPr>
-              <w:t>Hussain</w:t>
+              <w:t>Yazan</w:t>
             </w:r>
           </w:p>
         </w:tc>
@@ -10005,18 +10691,18 @@
               <w:rPr>
                 <w:b/>
                 <w:bCs/>
-                <w:sz w:val="32"/>
-                <w:szCs w:val="32"/>
+                <w:sz w:val="28"/>
+                <w:szCs w:val="28"/>
               </w:rPr>
             </w:pPr>
             <w:r>
               <w:rPr>
                 <w:b/>
                 <w:bCs/>
-                <w:sz w:val="32"/>
-                <w:szCs w:val="32"/>
-              </w:rPr>
-              <w:t>T9</w:t>
+                <w:sz w:val="28"/>
+                <w:szCs w:val="28"/>
+              </w:rPr>
+              <w:t>T12</w:t>
             </w:r>
           </w:p>
         </w:tc>
@@ -10041,7 +10727,7 @@
                 <w:sz w:val="28"/>
                 <w:szCs w:val="28"/>
               </w:rPr>
-              <w:t>Class diagram</w:t>
+              <w:t>task, durations, and dependences table</w:t>
             </w:r>
           </w:p>
         </w:tc>
@@ -10053,437 +10739,15 @@
             <w:pPr>
               <w:jc w:val="mediumKashida"/>
               <w:rPr>
+                <w:strike/>
                 <w:sz w:val="32"/>
                 <w:szCs w:val="32"/>
               </w:rPr>
             </w:pPr>
             <w:r>
               <w:rPr>
-                <w:sz w:val="32"/>
-                <w:szCs w:val="32"/>
-              </w:rPr>
-              <w:t xml:space="preserve">Reda </w:t>
-            </w:r>
-          </w:p>
-        </w:tc>
-        <w:tc>
-          <w:tcPr>
-            <w:tcW w:w="1641" w:type="dxa"/>
-          </w:tcPr>
-          <w:p>
-            <w:pPr>
-              <w:jc w:val="center"/>
-              <w:rPr>
-                <w:sz w:val="32"/>
-                <w:szCs w:val="32"/>
-              </w:rPr>
-            </w:pPr>
-            <w:r>
-              <w:rPr>
-                <w:rFonts w:ascii="Calibri" w:hAnsi="Calibri" w:cs="Calibri"/>
-                <w:color w:val="212121"/>
-                <w:sz w:val="32"/>
-                <w:szCs w:val="32"/>
-              </w:rPr>
-              <w:t>20</w:t>
-            </w:r>
-            <w:r>
-              <w:rPr>
-                <w:rFonts w:ascii="Calibri" w:hAnsi="Calibri" w:cs="Calibri"/>
-                <w:color w:val="212121"/>
-                <w:sz w:val="32"/>
-                <w:szCs w:val="32"/>
-                <w:vertAlign w:val="superscript"/>
-              </w:rPr>
-              <w:t>th</w:t>
-            </w:r>
-            <w:r>
-              <w:rPr>
-                <w:rFonts w:ascii="Calibri" w:hAnsi="Calibri" w:cs="Calibri"/>
-                <w:color w:val="212121"/>
-                <w:sz w:val="32"/>
-                <w:szCs w:val="32"/>
-              </w:rPr>
-              <w:t xml:space="preserve"> </w:t>
-            </w:r>
-            <w:r>
-              <w:rPr>
-                <w:sz w:val="32"/>
-                <w:szCs w:val="32"/>
-              </w:rPr>
-              <w:t>April</w:t>
-            </w:r>
-          </w:p>
-        </w:tc>
-        <w:tc>
-          <w:tcPr>
-            <w:tcW w:w="1144" w:type="dxa"/>
-          </w:tcPr>
-          <w:p>
-            <w:pPr>
-              <w:jc w:val="center"/>
-              <w:rPr>
-                <w:sz w:val="32"/>
-                <w:szCs w:val="32"/>
-              </w:rPr>
-            </w:pPr>
-            <w:r>
-              <w:rPr>
-                <w:rFonts w:ascii="Segoe UI Emoji" w:hAnsi="Segoe UI Emoji" w:cs="Segoe UI Emoji"/>
-                <w:sz w:val="32"/>
-                <w:szCs w:val="32"/>
-              </w:rPr>
-              <w:t>✅</w:t>
-            </w:r>
-          </w:p>
-        </w:tc>
-      </w:tr>
-      <w:tr>
-        <w:tc>
-          <w:tcPr>
-            <w:tcW w:w="720" w:type="dxa"/>
-          </w:tcPr>
-          <w:p>
-            <w:pPr>
-              <w:jc w:val="center"/>
-              <w:rPr>
-                <w:b/>
-                <w:bCs/>
-                <w:sz w:val="32"/>
-                <w:szCs w:val="32"/>
-              </w:rPr>
-            </w:pPr>
-            <w:r>
-              <w:rPr>
-                <w:b/>
-                <w:bCs/>
-                <w:sz w:val="32"/>
-                <w:szCs w:val="32"/>
-              </w:rPr>
-              <w:t>T10</w:t>
-            </w:r>
-          </w:p>
-        </w:tc>
-        <w:tc>
-          <w:tcPr>
-            <w:tcW w:w="3420" w:type="dxa"/>
-          </w:tcPr>
-          <w:p>
-            <w:pPr>
-              <w:jc w:val="mediumKashida"/>
-              <w:rPr>
-                <w:b/>
-                <w:bCs/>
-                <w:sz w:val="28"/>
-                <w:szCs w:val="28"/>
-              </w:rPr>
-            </w:pPr>
-            <w:r>
-              <w:rPr>
-                <w:b/>
-                <w:bCs/>
-                <w:sz w:val="28"/>
-                <w:szCs w:val="28"/>
-              </w:rPr>
-              <w:t>State machine diagram</w:t>
-            </w:r>
-          </w:p>
-        </w:tc>
-        <w:tc>
-          <w:tcPr>
-            <w:tcW w:w="1710" w:type="dxa"/>
-          </w:tcPr>
-          <w:p>
-            <w:pPr>
-              <w:jc w:val="mediumKashida"/>
-              <w:rPr>
-                <w:sz w:val="32"/>
-                <w:szCs w:val="32"/>
-              </w:rPr>
-            </w:pPr>
-            <w:r>
-              <w:rPr>
-                <w:sz w:val="32"/>
-                <w:szCs w:val="32"/>
-              </w:rPr>
-              <w:t>Hussain</w:t>
-            </w:r>
-          </w:p>
-        </w:tc>
-        <w:tc>
-          <w:tcPr>
-            <w:tcW w:w="1641" w:type="dxa"/>
-            <w:vMerge w:val="restart"/>
-          </w:tcPr>
-          <w:p>
-            <w:pPr>
-              <w:jc w:val="center"/>
-              <w:rPr>
-                <w:rFonts w:ascii="Calibri" w:hAnsi="Calibri" w:cs="Calibri"/>
-                <w:color w:val="212121"/>
-                <w:sz w:val="32"/>
-                <w:szCs w:val="32"/>
-              </w:rPr>
-            </w:pPr>
-          </w:p>
-          <w:p>
-            <w:pPr>
-              <w:jc w:val="center"/>
-              <w:rPr>
-                <w:rFonts w:ascii="Calibri" w:hAnsi="Calibri" w:cs="Calibri"/>
-                <w:color w:val="212121"/>
-                <w:sz w:val="32"/>
-                <w:szCs w:val="32"/>
-              </w:rPr>
-            </w:pPr>
-          </w:p>
-          <w:p>
-            <w:pPr>
-              <w:jc w:val="center"/>
-              <w:rPr>
-                <w:rFonts w:ascii="Calibri" w:hAnsi="Calibri" w:cs="Calibri"/>
-                <w:color w:val="212121"/>
-                <w:sz w:val="32"/>
-                <w:szCs w:val="32"/>
-              </w:rPr>
-            </w:pPr>
-          </w:p>
-          <w:p>
-            <w:pPr>
-              <w:jc w:val="center"/>
-              <w:rPr>
-                <w:sz w:val="32"/>
-                <w:szCs w:val="32"/>
-              </w:rPr>
-            </w:pPr>
-            <w:r>
-              <w:rPr>
-                <w:rFonts w:ascii="Calibri" w:hAnsi="Calibri" w:cs="Calibri"/>
-                <w:color w:val="212121"/>
-                <w:sz w:val="32"/>
-                <w:szCs w:val="32"/>
-              </w:rPr>
-              <w:t>2</w:t>
-            </w:r>
-            <w:r>
-              <w:rPr>
-                <w:rFonts w:ascii="Calibri" w:hAnsi="Calibri" w:cs="Calibri"/>
-                <w:color w:val="212121"/>
-                <w:sz w:val="32"/>
-                <w:szCs w:val="32"/>
-              </w:rPr>
-              <w:t>1</w:t>
-            </w:r>
-            <w:r>
-              <w:rPr>
-                <w:rFonts w:ascii="Calibri" w:hAnsi="Calibri" w:cs="Calibri"/>
-                <w:color w:val="212121"/>
-                <w:sz w:val="32"/>
-                <w:szCs w:val="32"/>
-                <w:vertAlign w:val="superscript"/>
-              </w:rPr>
-              <w:t>th</w:t>
-            </w:r>
-            <w:r>
-              <w:rPr>
-                <w:rFonts w:ascii="Calibri" w:hAnsi="Calibri" w:cs="Calibri"/>
-                <w:color w:val="212121"/>
-                <w:sz w:val="32"/>
-                <w:szCs w:val="32"/>
-              </w:rPr>
-              <w:t xml:space="preserve"> </w:t>
-            </w:r>
-            <w:r>
-              <w:rPr>
-                <w:sz w:val="32"/>
-                <w:szCs w:val="32"/>
-              </w:rPr>
-              <w:t>April</w:t>
-            </w:r>
-          </w:p>
-        </w:tc>
-        <w:tc>
-          <w:tcPr>
-            <w:tcW w:w="1144" w:type="dxa"/>
-          </w:tcPr>
-          <w:p>
-            <w:pPr>
-              <w:jc w:val="center"/>
-              <w:rPr>
-                <w:sz w:val="32"/>
-                <w:szCs w:val="32"/>
-              </w:rPr>
-            </w:pPr>
-          </w:p>
-        </w:tc>
-      </w:tr>
-      <w:tr>
-        <w:tc>
-          <w:tcPr>
-            <w:tcW w:w="720" w:type="dxa"/>
-          </w:tcPr>
-          <w:p>
-            <w:pPr>
-              <w:jc w:val="center"/>
-              <w:rPr>
-                <w:b/>
-                <w:bCs/>
-                <w:sz w:val="32"/>
-                <w:szCs w:val="32"/>
-              </w:rPr>
-            </w:pPr>
-            <w:r>
-              <w:rPr>
-                <w:b/>
-                <w:bCs/>
-                <w:sz w:val="32"/>
-                <w:szCs w:val="32"/>
-              </w:rPr>
-              <w:t>T11</w:t>
-            </w:r>
-          </w:p>
-        </w:tc>
-        <w:tc>
-          <w:tcPr>
-            <w:tcW w:w="3420" w:type="dxa"/>
-          </w:tcPr>
-          <w:p>
-            <w:pPr>
-              <w:jc w:val="mediumKashida"/>
-              <w:rPr>
-                <w:b/>
-                <w:bCs/>
-                <w:sz w:val="28"/>
-                <w:szCs w:val="28"/>
-              </w:rPr>
-            </w:pPr>
-            <w:r>
-              <w:rPr>
-                <w:b/>
-                <w:bCs/>
-                <w:sz w:val="28"/>
-                <w:szCs w:val="28"/>
-              </w:rPr>
-              <w:t>Test cases</w:t>
-            </w:r>
-          </w:p>
-        </w:tc>
-        <w:tc>
-          <w:tcPr>
-            <w:tcW w:w="1710" w:type="dxa"/>
-          </w:tcPr>
-          <w:p>
-            <w:pPr>
-              <w:jc w:val="mediumKashida"/>
-              <w:rPr>
-                <w:sz w:val="32"/>
-                <w:szCs w:val="32"/>
-              </w:rPr>
-            </w:pPr>
-            <w:r>
-              <w:rPr>
-                <w:sz w:val="32"/>
-                <w:szCs w:val="32"/>
-              </w:rPr>
-              <w:t>Yazan</w:t>
-            </w:r>
-          </w:p>
-        </w:tc>
-        <w:tc>
-          <w:tcPr>
-            <w:tcW w:w="1641" w:type="dxa"/>
-            <w:vMerge/>
-          </w:tcPr>
-          <w:p>
-            <w:pPr>
-              <w:jc w:val="center"/>
-              <w:rPr>
-                <w:sz w:val="32"/>
-                <w:szCs w:val="32"/>
-              </w:rPr>
-            </w:pPr>
-          </w:p>
-        </w:tc>
-        <w:tc>
-          <w:tcPr>
-            <w:tcW w:w="1144" w:type="dxa"/>
-          </w:tcPr>
-          <w:p>
-            <w:pPr>
-              <w:jc w:val="center"/>
-              <w:rPr>
-                <w:sz w:val="32"/>
-                <w:szCs w:val="32"/>
-              </w:rPr>
-            </w:pPr>
-          </w:p>
-        </w:tc>
-      </w:tr>
-      <w:tr>
-        <w:tc>
-          <w:tcPr>
-            <w:tcW w:w="720" w:type="dxa"/>
-          </w:tcPr>
-          <w:p>
-            <w:pPr>
-              <w:jc w:val="center"/>
-              <w:rPr>
-                <w:b/>
-                <w:bCs/>
-                <w:sz w:val="28"/>
-                <w:szCs w:val="28"/>
-              </w:rPr>
-            </w:pPr>
-            <w:r>
-              <w:rPr>
-                <w:b/>
-                <w:bCs/>
-                <w:sz w:val="28"/>
-                <w:szCs w:val="28"/>
-              </w:rPr>
-              <w:t>T12</w:t>
-            </w:r>
-          </w:p>
-        </w:tc>
-        <w:tc>
-          <w:tcPr>
-            <w:tcW w:w="3420" w:type="dxa"/>
-          </w:tcPr>
-          <w:p>
-            <w:pPr>
-              <w:jc w:val="mediumKashida"/>
-              <w:rPr>
-                <w:b/>
-                <w:bCs/>
-                <w:sz w:val="28"/>
-                <w:szCs w:val="28"/>
-              </w:rPr>
-            </w:pPr>
-            <w:r>
-              <w:rPr>
-                <w:b/>
-                <w:bCs/>
-                <w:sz w:val="28"/>
-                <w:szCs w:val="28"/>
-              </w:rPr>
-              <w:t>task, durations, and dependences table</w:t>
-            </w:r>
-          </w:p>
-        </w:tc>
-        <w:tc>
-          <w:tcPr>
-            <w:tcW w:w="1710" w:type="dxa"/>
-          </w:tcPr>
-          <w:p>
-            <w:pPr>
-              <w:jc w:val="mediumKashida"/>
-              <w:rPr>
-                <w:sz w:val="32"/>
-                <w:szCs w:val="32"/>
-              </w:rPr>
-            </w:pPr>
-            <w:r>
-              <w:rPr>
+                <w:strike/>
+                <w:color w:val="EE0000"/>
                 <w:sz w:val="32"/>
                 <w:szCs w:val="32"/>
               </w:rPr>
@@ -10808,12 +11072,15 @@
             <w:pPr>
               <w:jc w:val="mediumKashida"/>
               <w:rPr>
+                <w:strike/>
                 <w:sz w:val="32"/>
                 <w:szCs w:val="32"/>
               </w:rPr>
             </w:pPr>
             <w:r>
               <w:rPr>
+                <w:strike/>
+                <w:color w:val="EE0000"/>
                 <w:sz w:val="32"/>
                 <w:szCs w:val="32"/>
               </w:rPr>
@@ -11154,7 +11421,7 @@
       </w:pPr>
     </w:p>
     <w:sectPr>
-      <w:footerReference w:type="default" r:id="rId12"/>
+      <w:footerReference w:type="default" r:id="rId22"/>
       <w:pgSz w:w="12240" w:h="15840"/>
       <w:pgMar w:top="1440" w:right="1800" w:bottom="1440" w:left="1800" w:header="720" w:footer="720" w:gutter="0"/>
       <w:cols w:space="720"/>

</xml_diff>

<commit_message>
Here I done of my parts and I made the structure of the code
</commit_message>
<xml_diff>
--- a/docs/SRS - LBMS.docx
+++ b/docs/SRS - LBMS.docx
@@ -823,10 +823,10 @@
         <w:t xml:space="preserve"> Dr. Majed Al-Saeed</w:t>
       </w:r>
     </w:p>
-    <w:bookmarkStart w:id="0" w:name="_Toc225226026" w:displacedByCustomXml="next"/>
-    <w:bookmarkStart w:id="1" w:name="_Toc225350573" w:displacedByCustomXml="next"/>
-    <w:bookmarkStart w:id="2" w:name="_Toc225350652" w:displacedByCustomXml="next"/>
-    <w:bookmarkStart w:id="3" w:name="_Toc226815504" w:displacedByCustomXml="next"/>
+    <w:bookmarkStart w:id="0" w:name="_Toc226815504" w:displacedByCustomXml="next"/>
+    <w:bookmarkStart w:id="1" w:name="_Toc225350652" w:displacedByCustomXml="next"/>
+    <w:bookmarkStart w:id="2" w:name="_Toc225350573" w:displacedByCustomXml="next"/>
+    <w:bookmarkStart w:id="3" w:name="_Toc225226026" w:displacedByCustomXml="next"/>
     <w:sdt>
       <w:sdtPr>
         <w:rPr>
@@ -8890,7 +8890,7 @@
           <w:szCs w:val="36"/>
         </w:rPr>
         <w:drawing>
-          <wp:anchor distT="0" distB="0" distL="114300" distR="114300" simplePos="0" relativeHeight="251678720" behindDoc="0" locked="0" layoutInCell="1" allowOverlap="1" wp14:anchorId="0DF21AB1" wp14:editId="4145773D">
+          <wp:anchor distT="0" distB="0" distL="114300" distR="114300" simplePos="0" relativeHeight="251678720" behindDoc="0" locked="0" layoutInCell="1" allowOverlap="1" wp14:anchorId="0DF21AB1" wp14:editId="6476DE9F">
             <wp:simplePos x="0" y="0"/>
             <wp:positionH relativeFrom="column">
               <wp:posOffset>-266700</wp:posOffset>
@@ -9008,7 +9008,7 @@
           <w:szCs w:val="48"/>
         </w:rPr>
         <w:drawing>
-          <wp:anchor distT="0" distB="0" distL="114300" distR="114300" simplePos="0" relativeHeight="251661312" behindDoc="0" locked="0" layoutInCell="1" allowOverlap="1" wp14:anchorId="0CABA036" wp14:editId="76D2B3D5">
+          <wp:anchor distT="0" distB="0" distL="114300" distR="114300" simplePos="0" relativeHeight="251661312" behindDoc="0" locked="0" layoutInCell="1" allowOverlap="1" wp14:anchorId="0CABA036" wp14:editId="2C69733E">
             <wp:simplePos x="0" y="0"/>
             <wp:positionH relativeFrom="margin">
               <wp:align>center</wp:align>
@@ -9016,13 +9016,13 @@
             <wp:positionV relativeFrom="paragraph">
               <wp:posOffset>522605</wp:posOffset>
             </wp:positionV>
-            <wp:extent cx="7550785" cy="4493260"/>
-            <wp:effectExtent l="0" t="0" r="0" b="2540"/>
+            <wp:extent cx="7550785" cy="4492625"/>
+            <wp:effectExtent l="0" t="0" r="0" b="3175"/>
             <wp:wrapThrough wrapText="bothSides">
               <wp:wrapPolygon edited="0">
                 <wp:start x="0" y="0"/>
-                <wp:lineTo x="0" y="21521"/>
-                <wp:lineTo x="21526" y="21521"/>
+                <wp:lineTo x="0" y="21524"/>
+                <wp:lineTo x="21526" y="21524"/>
                 <wp:lineTo x="21526" y="0"/>
                 <wp:lineTo x="0" y="0"/>
               </wp:wrapPolygon>
@@ -9057,7 +9057,7 @@
                   <pic:spPr>
                     <a:xfrm>
                       <a:off x="0" y="0"/>
-                      <a:ext cx="7551010" cy="4493260"/>
+                      <a:ext cx="7551010" cy="4493259"/>
                     </a:xfrm>
                     <a:prstGeom prst="rect">
                       <a:avLst/>
@@ -25290,16 +25290,7 @@
                 <w:sz w:val="32"/>
                 <w:szCs w:val="32"/>
               </w:rPr>
-              <w:t>1</w:t>
-            </w:r>
-            <w:r>
-              <w:rPr>
-                <w:rFonts w:ascii="Calibri" w:hAnsi="Calibri" w:cs="Calibri"/>
-                <w:color w:val="212121"/>
-                <w:sz w:val="32"/>
-                <w:szCs w:val="32"/>
-              </w:rPr>
-              <w:t>7</w:t>
+              <w:t>17</w:t>
             </w:r>
             <w:r>
               <w:rPr>

</xml_diff>

<commit_message>
Here I merge every others parts and corrct what it needs to be corrected
</commit_message>
<xml_diff>
--- a/docs/SRS - LBMS.docx
+++ b/docs/SRS - LBMS.docx
@@ -823,10 +823,10 @@
         <w:t xml:space="preserve"> Dr. Majed Al-Saeed</w:t>
       </w:r>
     </w:p>
-    <w:bookmarkStart w:id="0" w:name="_Toc226815504" w:displacedByCustomXml="next"/>
-    <w:bookmarkStart w:id="1" w:name="_Toc225350652" w:displacedByCustomXml="next"/>
-    <w:bookmarkStart w:id="2" w:name="_Toc225350573" w:displacedByCustomXml="next"/>
-    <w:bookmarkStart w:id="3" w:name="_Toc225226026" w:displacedByCustomXml="next"/>
+    <w:bookmarkStart w:id="0" w:name="_Toc225226026" w:displacedByCustomXml="next"/>
+    <w:bookmarkStart w:id="1" w:name="_Toc225350573" w:displacedByCustomXml="next"/>
+    <w:bookmarkStart w:id="2" w:name="_Toc225350652" w:displacedByCustomXml="next"/>
+    <w:bookmarkStart w:id="3" w:name="_Toc226815504" w:displacedByCustomXml="next"/>
     <w:sdt>
       <w:sdtPr>
         <w:rPr>
@@ -8890,7 +8890,7 @@
           <w:szCs w:val="36"/>
         </w:rPr>
         <w:drawing>
-          <wp:anchor distT="0" distB="0" distL="114300" distR="114300" simplePos="0" relativeHeight="251678720" behindDoc="0" locked="0" layoutInCell="1" allowOverlap="1" wp14:anchorId="0DF21AB1" wp14:editId="6476DE9F">
+          <wp:anchor distT="0" distB="0" distL="114300" distR="114300" simplePos="0" relativeHeight="251678720" behindDoc="0" locked="0" layoutInCell="1" allowOverlap="1" wp14:anchorId="0DF21AB1" wp14:editId="0C9B7F2B">
             <wp:simplePos x="0" y="0"/>
             <wp:positionH relativeFrom="column">
               <wp:posOffset>-266700</wp:posOffset>
@@ -9008,7 +9008,7 @@
           <w:szCs w:val="48"/>
         </w:rPr>
         <w:drawing>
-          <wp:anchor distT="0" distB="0" distL="114300" distR="114300" simplePos="0" relativeHeight="251661312" behindDoc="0" locked="0" layoutInCell="1" allowOverlap="1" wp14:anchorId="0CABA036" wp14:editId="2C69733E">
+          <wp:anchor distT="0" distB="0" distL="114300" distR="114300" simplePos="0" relativeHeight="251661312" behindDoc="0" locked="0" layoutInCell="1" allowOverlap="1" wp14:anchorId="0CABA036" wp14:editId="6760EE1B">
             <wp:simplePos x="0" y="0"/>
             <wp:positionH relativeFrom="margin">
               <wp:align>center</wp:align>
@@ -9016,14 +9016,14 @@
             <wp:positionV relativeFrom="paragraph">
               <wp:posOffset>522605</wp:posOffset>
             </wp:positionV>
-            <wp:extent cx="7550785" cy="4492625"/>
+            <wp:extent cx="7548245" cy="4492625"/>
             <wp:effectExtent l="0" t="0" r="0" b="3175"/>
             <wp:wrapThrough wrapText="bothSides">
               <wp:wrapPolygon edited="0">
                 <wp:start x="0" y="0"/>
                 <wp:lineTo x="0" y="21524"/>
-                <wp:lineTo x="21526" y="21524"/>
-                <wp:lineTo x="21526" y="0"/>
+                <wp:lineTo x="21533" y="21524"/>
+                <wp:lineTo x="21533" y="0"/>
                 <wp:lineTo x="0" y="0"/>
               </wp:wrapPolygon>
             </wp:wrapThrough>
@@ -9057,7 +9057,7 @@
                   <pic:spPr>
                     <a:xfrm>
                       <a:off x="0" y="0"/>
-                      <a:ext cx="7551010" cy="4493259"/>
+                      <a:ext cx="7548364" cy="4493259"/>
                     </a:xfrm>
                     <a:prstGeom prst="rect">
                       <a:avLst/>
@@ -25499,6 +25499,14 @@
                 <w:szCs w:val="32"/>
               </w:rPr>
             </w:pPr>
+            <w:r>
+              <w:rPr>
+                <w:rFonts w:ascii="Segoe UI Emoji" w:hAnsi="Segoe UI Emoji" w:cs="Segoe UI Emoji"/>
+                <w:sz w:val="32"/>
+                <w:szCs w:val="32"/>
+              </w:rPr>
+              <w:t>✅</w:t>
+            </w:r>
           </w:p>
         </w:tc>
       </w:tr>
@@ -25585,6 +25593,14 @@
                 <w:szCs w:val="32"/>
               </w:rPr>
             </w:pPr>
+            <w:r>
+              <w:rPr>
+                <w:rFonts w:ascii="Segoe UI Emoji" w:hAnsi="Segoe UI Emoji" w:cs="Segoe UI Emoji"/>
+                <w:sz w:val="32"/>
+                <w:szCs w:val="32"/>
+              </w:rPr>
+              <w:t>✅</w:t>
+            </w:r>
           </w:p>
         </w:tc>
       </w:tr>
@@ -25671,6 +25687,14 @@
                 <w:szCs w:val="32"/>
               </w:rPr>
             </w:pPr>
+            <w:r>
+              <w:rPr>
+                <w:rFonts w:ascii="Segoe UI Emoji" w:hAnsi="Segoe UI Emoji" w:cs="Segoe UI Emoji"/>
+                <w:sz w:val="32"/>
+                <w:szCs w:val="32"/>
+              </w:rPr>
+              <w:t>✅</w:t>
+            </w:r>
           </w:p>
         </w:tc>
       </w:tr>

</xml_diff>

<commit_message>
Here I merge every others parts toghother and corrcet what it needs to be corrected
</commit_message>
<xml_diff>
--- a/docs/SRS - LBMS.docx
+++ b/docs/SRS - LBMS.docx
@@ -8890,7 +8890,7 @@
           <w:szCs w:val="36"/>
         </w:rPr>
         <w:drawing>
-          <wp:anchor distT="0" distB="0" distL="114300" distR="114300" simplePos="0" relativeHeight="251678720" behindDoc="0" locked="0" layoutInCell="1" allowOverlap="1" wp14:anchorId="0DF21AB1" wp14:editId="0C9B7F2B">
+          <wp:anchor distT="0" distB="0" distL="114300" distR="114300" simplePos="0" relativeHeight="251678720" behindDoc="0" locked="0" layoutInCell="1" allowOverlap="1" wp14:anchorId="0DF21AB1" wp14:editId="00B6A5AD">
             <wp:simplePos x="0" y="0"/>
             <wp:positionH relativeFrom="column">
               <wp:posOffset>-266700</wp:posOffset>
@@ -9008,7 +9008,7 @@
           <w:szCs w:val="48"/>
         </w:rPr>
         <w:drawing>
-          <wp:anchor distT="0" distB="0" distL="114300" distR="114300" simplePos="0" relativeHeight="251661312" behindDoc="0" locked="0" layoutInCell="1" allowOverlap="1" wp14:anchorId="0CABA036" wp14:editId="6760EE1B">
+          <wp:anchor distT="0" distB="0" distL="114300" distR="114300" simplePos="0" relativeHeight="251661312" behindDoc="0" locked="0" layoutInCell="1" allowOverlap="1" wp14:anchorId="0CABA036" wp14:editId="0904301E">
             <wp:simplePos x="0" y="0"/>
             <wp:positionH relativeFrom="margin">
               <wp:align>center</wp:align>
@@ -9027,9 +9027,7 @@
                 <wp:lineTo x="0" y="0"/>
               </wp:wrapPolygon>
             </wp:wrapThrough>
-            <wp:docPr id="1957838777" name="صورة 1">
-              <a:hlinkClick xmlns:a="http://schemas.openxmlformats.org/drawingml/2006/main" r:id="rId24"/>
-            </wp:docPr>
+            <wp:docPr id="1957838777" name="صورة 1"/>
             <wp:cNvGraphicFramePr>
               <a:graphicFrameLocks xmlns:a="http://schemas.openxmlformats.org/drawingml/2006/main" noChangeAspect="1"/>
             </wp:cNvGraphicFramePr>
@@ -9037,13 +9035,11 @@
               <a:graphicData uri="http://schemas.openxmlformats.org/drawingml/2006/picture">
                 <pic:pic xmlns:pic="http://schemas.openxmlformats.org/drawingml/2006/picture">
                   <pic:nvPicPr>
-                    <pic:cNvPr id="1957838777" name="صورة 1">
-                      <a:hlinkClick r:id="rId24"/>
-                    </pic:cNvPr>
+                    <pic:cNvPr id="1957838777" name="صورة 1"/>
                     <pic:cNvPicPr/>
                   </pic:nvPicPr>
                   <pic:blipFill>
-                    <a:blip r:embed="rId25" cstate="print">
+                    <a:blip r:embed="rId24" cstate="print">
                       <a:extLst>
                         <a:ext uri="{28A0092B-C50C-407E-A947-70E740481C1C}">
                           <a14:useLocalDpi xmlns:a14="http://schemas.microsoft.com/office/drawing/2010/main" val="0"/>
@@ -9146,7 +9142,7 @@
               </wp:wrapPolygon>
             </wp:wrapThrough>
             <wp:docPr id="1393047075" name="صورة 12">
-              <a:hlinkClick xmlns:a="http://schemas.openxmlformats.org/drawingml/2006/main" r:id="rId26"/>
+              <a:hlinkClick xmlns:a="http://schemas.openxmlformats.org/drawingml/2006/main" r:id="rId25"/>
             </wp:docPr>
             <wp:cNvGraphicFramePr>
               <a:graphicFrameLocks xmlns:a="http://schemas.openxmlformats.org/drawingml/2006/main" noChangeAspect="1"/>
@@ -9156,12 +9152,12 @@
                 <pic:pic xmlns:pic="http://schemas.openxmlformats.org/drawingml/2006/picture">
                   <pic:nvPicPr>
                     <pic:cNvPr id="1393047075" name="صورة 12">
-                      <a:hlinkClick r:id="rId26"/>
+                      <a:hlinkClick r:id="rId25"/>
                     </pic:cNvPr>
                     <pic:cNvPicPr/>
                   </pic:nvPicPr>
                   <pic:blipFill>
-                    <a:blip r:embed="rId27">
+                    <a:blip r:embed="rId26">
                       <a:extLst>
                         <a:ext uri="{28A0092B-C50C-407E-A947-70E740481C1C}">
                           <a14:useLocalDpi xmlns:a14="http://schemas.microsoft.com/office/drawing/2010/main" val="0"/>
@@ -25806,7 +25802,7 @@
       </w:pPr>
     </w:p>
     <w:sectPr>
-      <w:footerReference w:type="default" r:id="rId28"/>
+      <w:footerReference w:type="default" r:id="rId27"/>
       <w:pgSz w:w="12240" w:h="15840"/>
       <w:pgMar w:top="1440" w:right="1800" w:bottom="1440" w:left="1800" w:header="720" w:footer="720" w:gutter="0"/>
       <w:cols w:space="720"/>

</xml_diff>